<commit_message>
Revise wording on grouping, intervals, RBO weights and sentinel effect
- Gap under cluster grouping: shrinks substantially, mean Spearman gap near
  zero only at the coarsest grouping; RF gap at ~35 flows still positive in
  all repeats; RBO gaps shrink less (abstract, VI-C, X-A, conclusion).
- State that only the split into training halves is grouped; the outer
  80/20 split is random, so the designs show sensitivity to grouping, not a
  between-session effect (IV-D, VI-C, X-A, XI).
- Intervals: percentile intervals throughout (IV-H, IX, Table XII); drop the
  unsupported upward-bias explanation.
- RBO: distinguish geometric depth weights (0.65 over ten depths) from the
  rank weights of RBO (about 86% on the top ten ranks, Webber et al. Eq. 21).
- Sentinel: encoding effect comparable in scale to random-half variation.
</commit_message>
<xml_diff>
--- a/paper/Response_to_Reviewer_v7.docx
+++ b/paper/Response_to_Reviewer_v7.docx
@@ -17,7 +17,7 @@
     </w:p>
     <w:p>
       <w:r>
-        <w:t>We thank the reviewer for a careful and constructive report. Every result in the revised manuscript was recomputed in a single software environment, and several new analyses were added. Two of them changed the main conclusion: with cluster-grouped half-splits as the within-context reference, the cross-context gap largely disappears, and we no longer present the gap as a context effect. Section numbers below refer to the revised manuscript.</w:t>
+        <w:t>We thank the reviewer for a careful and constructive report. Every result in the revised manuscript was recomputed in a single software environment, and several new analyses were added. Two of them changed the main conclusion: with cluster-grouped half-splits as the within-context reference, the cross-context Spearman gap shrinks substantially (its mean approaches zero only under the coarsest grouping), and we no longer present the gap as a context effect. Section numbers below refer to the revised manuscript.</w:t>
       </w:r>
     </w:p>
     <w:p>
@@ -88,7 +88,7 @@
         </w:rPr>
       </w:r>
       <w:r>
-        <w:t>The abstract, Section VI-C, Section X-A and the conclusion now state that the cross-context difference cannot be distinguished from between-session (between-cluster) variation, and that the random-split gap should not be read as a context effect.</w:t>
+        <w:t>The abstract, Section VI-C, Section X-A and the conclusion now state that the gap shrinks substantially but does not vanish at intermediate grouping (Random Forest 0.042 with about 35 flows per cluster, positive in all 11 repeats; RBO gaps 0.063 and 0.084). They also state the scope of the design: only the division of the training data into halves is grouped, the outer 80/20 split is random, so the experiments show sensitivity to grouping and cannot measure a true between-session effect. The random-split gap is no longer read as a context effect.</w:t>
       </w:r>
     </w:p>
     <w:p>
@@ -250,7 +250,7 @@
         <w:t xml:space="preserve">Response: </w:t>
       </w:r>
       <w:r>
-        <w:t>We agree. Section IX now states that the S1-versus-S2 disagreement (1 − ρ = 0.06–0.11) is about 1.5 to 4 times smaller than the cross-context disagreement (the reviewer's 0.17–0.22 becomes 0.17–0.21 with the single-environment XGBoost refit) and is comparable to the disagreement between random halves of one context, and it explicitly withdraws the earlier statement.</w:t>
+        <w:t>We agree. Section IX now states that the S1-versus-S2 disagreement (1 − ρ = 0.06–0.11) is about 1.5 to 4 times smaller than the cross-context disagreement (the reviewer's 0.17–0.22 becomes 0.17–0.21 with the single-environment XGBoost refit) and is comparable in scale to random-half retraining variation (1 − ρ = 0.02–0.07; the ranges overlap, though encoding can produce the larger disagreement). It explicitly withdraws the earlier statement.</w:t>
       </w:r>
     </w:p>
     <w:p>

</xml_diff>